<commit_message>
Update scope of work matrix from revised quotation format 3
</commit_message>
<xml_diff>
--- a/Quotation Format - 3.docx
+++ b/Quotation Format - 3.docx
@@ -570,18 +570,18 @@
               <w:jc w:val="center"/>
               <w:rPr>
                 <w:rFonts w:ascii="Times New Roman" w:eastAsia="Times New Roman" w:hAnsi="Times New Roman" w:cs="Times New Roman"/>
-                <w:color w:val="000000"/>
-                <w:kern w:val="0"/>
-                <w:sz w:val="18"/>
-                <w:szCs w:val="18"/>
-                <w:lang w:eastAsia="en-IN"/>
-                <w14:ligatures w14:val="none"/>
-              </w:rPr>
-            </w:pPr>
-            <w:r>
-              <w:rPr>
-                <w:rFonts w:ascii="Times New Roman" w:eastAsia="Times New Roman" w:hAnsi="Times New Roman" w:cs="Times New Roman"/>
-                <w:color w:val="000000"/>
+                <w:color w:val="EE0000"/>
+                <w:kern w:val="0"/>
+                <w:sz w:val="18"/>
+                <w:szCs w:val="18"/>
+                <w:lang w:eastAsia="en-IN"/>
+                <w14:ligatures w14:val="none"/>
+              </w:rPr>
+            </w:pPr>
+            <w:r>
+              <w:rPr>
+                <w:rFonts w:ascii="Times New Roman" w:eastAsia="Times New Roman" w:hAnsi="Times New Roman" w:cs="Times New Roman"/>
+                <w:color w:val="EE0000"/>
                 <w:kern w:val="0"/>
                 <w:sz w:val="18"/>
                 <w:szCs w:val="18"/>
@@ -738,18 +738,18 @@
               <w:jc w:val="center"/>
               <w:rPr>
                 <w:rFonts w:ascii="Times New Roman" w:eastAsia="Times New Roman" w:hAnsi="Times New Roman" w:cs="Times New Roman"/>
-                <w:color w:val="000000"/>
-                <w:kern w:val="0"/>
-                <w:sz w:val="18"/>
-                <w:szCs w:val="18"/>
-                <w:lang w:eastAsia="en-IN"/>
-                <w14:ligatures w14:val="none"/>
-              </w:rPr>
-            </w:pPr>
-            <w:r>
-              <w:rPr>
-                <w:rFonts w:ascii="Times New Roman" w:eastAsia="Times New Roman" w:hAnsi="Times New Roman" w:cs="Times New Roman"/>
-                <w:color w:val="000000"/>
+                <w:color w:val="EE0000"/>
+                <w:kern w:val="0"/>
+                <w:sz w:val="18"/>
+                <w:szCs w:val="18"/>
+                <w:lang w:eastAsia="en-IN"/>
+                <w14:ligatures w14:val="none"/>
+              </w:rPr>
+            </w:pPr>
+            <w:r>
+              <w:rPr>
+                <w:rFonts w:ascii="Times New Roman" w:eastAsia="Times New Roman" w:hAnsi="Times New Roman" w:cs="Times New Roman"/>
+                <w:color w:val="EE0000"/>
                 <w:kern w:val="0"/>
                 <w:sz w:val="18"/>
                 <w:szCs w:val="18"/>
@@ -906,18 +906,18 @@
               <w:jc w:val="center"/>
               <w:rPr>
                 <w:rFonts w:ascii="Times New Roman" w:eastAsia="Times New Roman" w:hAnsi="Times New Roman" w:cs="Times New Roman"/>
-                <w:color w:val="000000"/>
-                <w:kern w:val="0"/>
-                <w:sz w:val="18"/>
-                <w:szCs w:val="18"/>
-                <w:lang w:eastAsia="en-IN"/>
-                <w14:ligatures w14:val="none"/>
-              </w:rPr>
-            </w:pPr>
-            <w:r>
-              <w:rPr>
-                <w:rFonts w:ascii="Times New Roman" w:eastAsia="Times New Roman" w:hAnsi="Times New Roman" w:cs="Times New Roman"/>
-                <w:color w:val="000000"/>
+                <w:color w:val="EE0000"/>
+                <w:kern w:val="0"/>
+                <w:sz w:val="18"/>
+                <w:szCs w:val="18"/>
+                <w:lang w:eastAsia="en-IN"/>
+                <w14:ligatures w14:val="none"/>
+              </w:rPr>
+            </w:pPr>
+            <w:r>
+              <w:rPr>
+                <w:rFonts w:ascii="Times New Roman" w:eastAsia="Times New Roman" w:hAnsi="Times New Roman" w:cs="Times New Roman"/>
+                <w:color w:val="EE0000"/>
                 <w:kern w:val="0"/>
                 <w:sz w:val="18"/>
                 <w:szCs w:val="18"/>
@@ -1074,18 +1074,18 @@
               <w:jc w:val="center"/>
               <w:rPr>
                 <w:rFonts w:ascii="Times New Roman" w:eastAsia="Times New Roman" w:hAnsi="Times New Roman" w:cs="Times New Roman"/>
-                <w:color w:val="000000"/>
-                <w:kern w:val="0"/>
-                <w:sz w:val="18"/>
-                <w:szCs w:val="18"/>
-                <w:lang w:eastAsia="en-IN"/>
-                <w14:ligatures w14:val="none"/>
-              </w:rPr>
-            </w:pPr>
-            <w:r>
-              <w:rPr>
-                <w:rFonts w:ascii="Times New Roman" w:eastAsia="Times New Roman" w:hAnsi="Times New Roman" w:cs="Times New Roman"/>
-                <w:color w:val="000000"/>
+                <w:color w:val="EE0000"/>
+                <w:kern w:val="0"/>
+                <w:sz w:val="18"/>
+                <w:szCs w:val="18"/>
+                <w:lang w:eastAsia="en-IN"/>
+                <w14:ligatures w14:val="none"/>
+              </w:rPr>
+            </w:pPr>
+            <w:r>
+              <w:rPr>
+                <w:rFonts w:ascii="Times New Roman" w:eastAsia="Times New Roman" w:hAnsi="Times New Roman" w:cs="Times New Roman"/>
+                <w:color w:val="EE0000"/>
                 <w:kern w:val="0"/>
                 <w:sz w:val="18"/>
                 <w:szCs w:val="18"/>
@@ -1255,18 +1255,18 @@
               <w:jc w:val="center"/>
               <w:rPr>
                 <w:rFonts w:ascii="Times New Roman" w:eastAsia="Times New Roman" w:hAnsi="Times New Roman" w:cs="Times New Roman"/>
-                <w:color w:val="000000"/>
-                <w:kern w:val="0"/>
-                <w:sz w:val="18"/>
-                <w:szCs w:val="18"/>
-                <w:lang w:eastAsia="en-IN"/>
-                <w14:ligatures w14:val="none"/>
-              </w:rPr>
-            </w:pPr>
-            <w:r>
-              <w:rPr>
-                <w:rFonts w:ascii="Times New Roman" w:eastAsia="Times New Roman" w:hAnsi="Times New Roman" w:cs="Times New Roman"/>
-                <w:color w:val="000000"/>
+                <w:color w:val="EE0000"/>
+                <w:kern w:val="0"/>
+                <w:sz w:val="18"/>
+                <w:szCs w:val="18"/>
+                <w:lang w:eastAsia="en-IN"/>
+                <w14:ligatures w14:val="none"/>
+              </w:rPr>
+            </w:pPr>
+            <w:r>
+              <w:rPr>
+                <w:rFonts w:ascii="Times New Roman" w:eastAsia="Times New Roman" w:hAnsi="Times New Roman" w:cs="Times New Roman"/>
+                <w:color w:val="EE0000"/>
                 <w:kern w:val="0"/>
                 <w:sz w:val="18"/>
                 <w:szCs w:val="18"/>
@@ -1423,18 +1423,18 @@
               <w:jc w:val="center"/>
               <w:rPr>
                 <w:rFonts w:ascii="Times New Roman" w:eastAsia="Times New Roman" w:hAnsi="Times New Roman" w:cs="Times New Roman"/>
-                <w:color w:val="000000"/>
-                <w:kern w:val="0"/>
-                <w:sz w:val="18"/>
-                <w:szCs w:val="18"/>
-                <w:lang w:eastAsia="en-IN"/>
-                <w14:ligatures w14:val="none"/>
-              </w:rPr>
-            </w:pPr>
-            <w:r>
-              <w:rPr>
-                <w:rFonts w:ascii="Times New Roman" w:eastAsia="Times New Roman" w:hAnsi="Times New Roman" w:cs="Times New Roman"/>
-                <w:color w:val="000000"/>
+                <w:color w:val="EE0000"/>
+                <w:kern w:val="0"/>
+                <w:sz w:val="18"/>
+                <w:szCs w:val="18"/>
+                <w:lang w:eastAsia="en-IN"/>
+                <w14:ligatures w14:val="none"/>
+              </w:rPr>
+            </w:pPr>
+            <w:r>
+              <w:rPr>
+                <w:rFonts w:ascii="Times New Roman" w:eastAsia="Times New Roman" w:hAnsi="Times New Roman" w:cs="Times New Roman"/>
+                <w:color w:val="EE0000"/>
                 <w:kern w:val="0"/>
                 <w:sz w:val="18"/>
                 <w:szCs w:val="18"/>
@@ -1591,18 +1591,18 @@
               <w:jc w:val="center"/>
               <w:rPr>
                 <w:rFonts w:ascii="Times New Roman" w:eastAsia="Times New Roman" w:hAnsi="Times New Roman" w:cs="Times New Roman"/>
-                <w:color w:val="000000"/>
-                <w:kern w:val="0"/>
-                <w:sz w:val="18"/>
-                <w:szCs w:val="18"/>
-                <w:lang w:eastAsia="en-IN"/>
-                <w14:ligatures w14:val="none"/>
-              </w:rPr>
-            </w:pPr>
-            <w:r>
-              <w:rPr>
-                <w:rFonts w:ascii="Times New Roman" w:eastAsia="Times New Roman" w:hAnsi="Times New Roman" w:cs="Times New Roman"/>
-                <w:color w:val="000000"/>
+                <w:color w:val="EE0000"/>
+                <w:kern w:val="0"/>
+                <w:sz w:val="18"/>
+                <w:szCs w:val="18"/>
+                <w:lang w:eastAsia="en-IN"/>
+                <w14:ligatures w14:val="none"/>
+              </w:rPr>
+            </w:pPr>
+            <w:r>
+              <w:rPr>
+                <w:rFonts w:ascii="Times New Roman" w:eastAsia="Times New Roman" w:hAnsi="Times New Roman" w:cs="Times New Roman"/>
+                <w:color w:val="EE0000"/>
                 <w:kern w:val="0"/>
                 <w:sz w:val="18"/>
                 <w:szCs w:val="18"/>
@@ -1759,18 +1759,18 @@
               <w:jc w:val="center"/>
               <w:rPr>
                 <w:rFonts w:ascii="Times New Roman" w:eastAsia="Times New Roman" w:hAnsi="Times New Roman" w:cs="Times New Roman"/>
-                <w:color w:val="000000"/>
-                <w:kern w:val="0"/>
-                <w:sz w:val="18"/>
-                <w:szCs w:val="18"/>
-                <w:lang w:eastAsia="en-IN"/>
-                <w14:ligatures w14:val="none"/>
-              </w:rPr>
-            </w:pPr>
-            <w:r>
-              <w:rPr>
-                <w:rFonts w:ascii="Times New Roman" w:eastAsia="Times New Roman" w:hAnsi="Times New Roman" w:cs="Times New Roman"/>
-                <w:color w:val="000000"/>
+                <w:color w:val="EE0000"/>
+                <w:kern w:val="0"/>
+                <w:sz w:val="18"/>
+                <w:szCs w:val="18"/>
+                <w:lang w:eastAsia="en-IN"/>
+                <w14:ligatures w14:val="none"/>
+              </w:rPr>
+            </w:pPr>
+            <w:r>
+              <w:rPr>
+                <w:rFonts w:ascii="Times New Roman" w:eastAsia="Times New Roman" w:hAnsi="Times New Roman" w:cs="Times New Roman"/>
+                <w:color w:val="EE0000"/>
                 <w:kern w:val="0"/>
                 <w:sz w:val="18"/>
                 <w:szCs w:val="18"/>
@@ -1927,18 +1927,18 @@
               <w:jc w:val="center"/>
               <w:rPr>
                 <w:rFonts w:ascii="Times New Roman" w:eastAsia="Times New Roman" w:hAnsi="Times New Roman" w:cs="Times New Roman"/>
-                <w:color w:val="000000"/>
-                <w:kern w:val="0"/>
-                <w:sz w:val="18"/>
-                <w:szCs w:val="18"/>
-                <w:lang w:eastAsia="en-IN"/>
-                <w14:ligatures w14:val="none"/>
-              </w:rPr>
-            </w:pPr>
-            <w:r>
-              <w:rPr>
-                <w:rFonts w:ascii="Times New Roman" w:eastAsia="Times New Roman" w:hAnsi="Times New Roman" w:cs="Times New Roman"/>
-                <w:color w:val="000000"/>
+                <w:color w:val="EE0000"/>
+                <w:kern w:val="0"/>
+                <w:sz w:val="18"/>
+                <w:szCs w:val="18"/>
+                <w:lang w:eastAsia="en-IN"/>
+                <w14:ligatures w14:val="none"/>
+              </w:rPr>
+            </w:pPr>
+            <w:r>
+              <w:rPr>
+                <w:rFonts w:ascii="Times New Roman" w:eastAsia="Times New Roman" w:hAnsi="Times New Roman" w:cs="Times New Roman"/>
+                <w:color w:val="EE0000"/>
                 <w:kern w:val="0"/>
                 <w:sz w:val="18"/>
                 <w:szCs w:val="18"/>
@@ -2241,18 +2241,18 @@
               <w:jc w:val="center"/>
               <w:rPr>
                 <w:rFonts w:ascii="Times New Roman" w:eastAsia="Times New Roman" w:hAnsi="Times New Roman" w:cs="Times New Roman"/>
-                <w:color w:val="000000"/>
-                <w:kern w:val="0"/>
-                <w:sz w:val="18"/>
-                <w:szCs w:val="18"/>
-                <w:lang w:eastAsia="en-IN"/>
-                <w14:ligatures w14:val="none"/>
-              </w:rPr>
-            </w:pPr>
-            <w:r>
-              <w:rPr>
-                <w:rFonts w:ascii="Times New Roman" w:eastAsia="Times New Roman" w:hAnsi="Times New Roman" w:cs="Times New Roman"/>
-                <w:color w:val="000000"/>
+                <w:color w:val="EE0000"/>
+                <w:kern w:val="0"/>
+                <w:sz w:val="18"/>
+                <w:szCs w:val="18"/>
+                <w:lang w:eastAsia="en-IN"/>
+                <w14:ligatures w14:val="none"/>
+              </w:rPr>
+            </w:pPr>
+            <w:r>
+              <w:rPr>
+                <w:rFonts w:ascii="Times New Roman" w:eastAsia="Times New Roman" w:hAnsi="Times New Roman" w:cs="Times New Roman"/>
+                <w:color w:val="EE0000"/>
                 <w:kern w:val="0"/>
                 <w:sz w:val="18"/>
                 <w:szCs w:val="18"/>
@@ -2409,18 +2409,18 @@
               <w:jc w:val="center"/>
               <w:rPr>
                 <w:rFonts w:ascii="Times New Roman" w:eastAsia="Times New Roman" w:hAnsi="Times New Roman" w:cs="Times New Roman"/>
-                <w:color w:val="000000"/>
-                <w:kern w:val="0"/>
-                <w:sz w:val="18"/>
-                <w:szCs w:val="18"/>
-                <w:lang w:eastAsia="en-IN"/>
-                <w14:ligatures w14:val="none"/>
-              </w:rPr>
-            </w:pPr>
-            <w:r>
-              <w:rPr>
-                <w:rFonts w:ascii="Times New Roman" w:eastAsia="Times New Roman" w:hAnsi="Times New Roman" w:cs="Times New Roman"/>
-                <w:color w:val="000000"/>
+                <w:color w:val="EE0000"/>
+                <w:kern w:val="0"/>
+                <w:sz w:val="18"/>
+                <w:szCs w:val="18"/>
+                <w:lang w:eastAsia="en-IN"/>
+                <w14:ligatures w14:val="none"/>
+              </w:rPr>
+            </w:pPr>
+            <w:r>
+              <w:rPr>
+                <w:rFonts w:ascii="Times New Roman" w:eastAsia="Times New Roman" w:hAnsi="Times New Roman" w:cs="Times New Roman"/>
+                <w:color w:val="EE0000"/>
                 <w:kern w:val="0"/>
                 <w:sz w:val="18"/>
                 <w:szCs w:val="18"/>
@@ -2577,18 +2577,18 @@
               <w:jc w:val="center"/>
               <w:rPr>
                 <w:rFonts w:ascii="Times New Roman" w:eastAsia="Times New Roman" w:hAnsi="Times New Roman" w:cs="Times New Roman"/>
-                <w:color w:val="000000"/>
-                <w:kern w:val="0"/>
-                <w:sz w:val="18"/>
-                <w:szCs w:val="18"/>
-                <w:lang w:eastAsia="en-IN"/>
-                <w14:ligatures w14:val="none"/>
-              </w:rPr>
-            </w:pPr>
-            <w:r>
-              <w:rPr>
-                <w:rFonts w:ascii="Times New Roman" w:eastAsia="Times New Roman" w:hAnsi="Times New Roman" w:cs="Times New Roman"/>
-                <w:color w:val="000000"/>
+                <w:color w:val="EE0000"/>
+                <w:kern w:val="0"/>
+                <w:sz w:val="18"/>
+                <w:szCs w:val="18"/>
+                <w:lang w:eastAsia="en-IN"/>
+                <w14:ligatures w14:val="none"/>
+              </w:rPr>
+            </w:pPr>
+            <w:r>
+              <w:rPr>
+                <w:rFonts w:ascii="Times New Roman" w:eastAsia="Times New Roman" w:hAnsi="Times New Roman" w:cs="Times New Roman"/>
+                <w:color w:val="EE0000"/>
                 <w:kern w:val="0"/>
                 <w:sz w:val="18"/>
                 <w:szCs w:val="18"/>
@@ -2745,18 +2745,18 @@
               <w:jc w:val="center"/>
               <w:rPr>
                 <w:rFonts w:ascii="Times New Roman" w:eastAsia="Times New Roman" w:hAnsi="Times New Roman" w:cs="Times New Roman"/>
-                <w:color w:val="000000"/>
-                <w:kern w:val="0"/>
-                <w:sz w:val="18"/>
-                <w:szCs w:val="18"/>
-                <w:lang w:eastAsia="en-IN"/>
-                <w14:ligatures w14:val="none"/>
-              </w:rPr>
-            </w:pPr>
-            <w:r>
-              <w:rPr>
-                <w:rFonts w:ascii="Times New Roman" w:eastAsia="Times New Roman" w:hAnsi="Times New Roman" w:cs="Times New Roman"/>
-                <w:color w:val="000000"/>
+                <w:color w:val="EE0000"/>
+                <w:kern w:val="0"/>
+                <w:sz w:val="18"/>
+                <w:szCs w:val="18"/>
+                <w:lang w:eastAsia="en-IN"/>
+                <w14:ligatures w14:val="none"/>
+              </w:rPr>
+            </w:pPr>
+            <w:r>
+              <w:rPr>
+                <w:rFonts w:ascii="Times New Roman" w:eastAsia="Times New Roman" w:hAnsi="Times New Roman" w:cs="Times New Roman"/>
+                <w:color w:val="EE0000"/>
                 <w:kern w:val="0"/>
                 <w:sz w:val="18"/>
                 <w:szCs w:val="18"/>
@@ -2913,18 +2913,18 @@
               <w:jc w:val="center"/>
               <w:rPr>
                 <w:rFonts w:ascii="Times New Roman" w:eastAsia="Times New Roman" w:hAnsi="Times New Roman" w:cs="Times New Roman"/>
-                <w:color w:val="000000"/>
-                <w:kern w:val="0"/>
-                <w:sz w:val="18"/>
-                <w:szCs w:val="18"/>
-                <w:lang w:eastAsia="en-IN"/>
-                <w14:ligatures w14:val="none"/>
-              </w:rPr>
-            </w:pPr>
-            <w:r>
-              <w:rPr>
-                <w:rFonts w:ascii="Times New Roman" w:eastAsia="Times New Roman" w:hAnsi="Times New Roman" w:cs="Times New Roman"/>
-                <w:color w:val="000000"/>
+                <w:color w:val="EE0000"/>
+                <w:kern w:val="0"/>
+                <w:sz w:val="18"/>
+                <w:szCs w:val="18"/>
+                <w:lang w:eastAsia="en-IN"/>
+                <w14:ligatures w14:val="none"/>
+              </w:rPr>
+            </w:pPr>
+            <w:r>
+              <w:rPr>
+                <w:rFonts w:ascii="Times New Roman" w:eastAsia="Times New Roman" w:hAnsi="Times New Roman" w:cs="Times New Roman"/>
+                <w:color w:val="EE0000"/>
                 <w:kern w:val="0"/>
                 <w:sz w:val="18"/>
                 <w:szCs w:val="18"/>
@@ -3229,18 +3229,18 @@
               <w:jc w:val="center"/>
               <w:rPr>
                 <w:rFonts w:ascii="Times New Roman" w:eastAsia="Times New Roman" w:hAnsi="Times New Roman" w:cs="Times New Roman"/>
-                <w:color w:val="000000"/>
-                <w:kern w:val="0"/>
-                <w:sz w:val="18"/>
-                <w:szCs w:val="18"/>
-                <w:lang w:eastAsia="en-IN"/>
-                <w14:ligatures w14:val="none"/>
-              </w:rPr>
-            </w:pPr>
-            <w:r>
-              <w:rPr>
-                <w:rFonts w:ascii="Times New Roman" w:eastAsia="Times New Roman" w:hAnsi="Times New Roman" w:cs="Times New Roman"/>
-                <w:color w:val="000000"/>
+                <w:color w:val="EE0000"/>
+                <w:kern w:val="0"/>
+                <w:sz w:val="18"/>
+                <w:szCs w:val="18"/>
+                <w:lang w:eastAsia="en-IN"/>
+                <w14:ligatures w14:val="none"/>
+              </w:rPr>
+            </w:pPr>
+            <w:r>
+              <w:rPr>
+                <w:rFonts w:ascii="Times New Roman" w:eastAsia="Times New Roman" w:hAnsi="Times New Roman" w:cs="Times New Roman"/>
+                <w:color w:val="EE0000"/>
                 <w:kern w:val="0"/>
                 <w:sz w:val="18"/>
                 <w:szCs w:val="18"/>
@@ -3398,18 +3398,18 @@
               <w:jc w:val="center"/>
               <w:rPr>
                 <w:rFonts w:ascii="Times New Roman" w:eastAsia="Times New Roman" w:hAnsi="Times New Roman" w:cs="Times New Roman"/>
-                <w:color w:val="000000"/>
-                <w:kern w:val="0"/>
-                <w:sz w:val="18"/>
-                <w:szCs w:val="18"/>
-                <w:lang w:eastAsia="en-IN"/>
-                <w14:ligatures w14:val="none"/>
-              </w:rPr>
-            </w:pPr>
-            <w:r>
-              <w:rPr>
-                <w:rFonts w:ascii="Times New Roman" w:eastAsia="Times New Roman" w:hAnsi="Times New Roman" w:cs="Times New Roman"/>
-                <w:color w:val="000000"/>
+                <w:color w:val="EE0000"/>
+                <w:kern w:val="0"/>
+                <w:sz w:val="18"/>
+                <w:szCs w:val="18"/>
+                <w:lang w:eastAsia="en-IN"/>
+                <w14:ligatures w14:val="none"/>
+              </w:rPr>
+            </w:pPr>
+            <w:r>
+              <w:rPr>
+                <w:rFonts w:ascii="Times New Roman" w:eastAsia="Times New Roman" w:hAnsi="Times New Roman" w:cs="Times New Roman"/>
+                <w:color w:val="EE0000"/>
                 <w:kern w:val="0"/>
                 <w:sz w:val="18"/>
                 <w:szCs w:val="18"/>
@@ -3568,18 +3568,18 @@
               <w:jc w:val="center"/>
               <w:rPr>
                 <w:rFonts w:ascii="Times New Roman" w:eastAsia="Times New Roman" w:hAnsi="Times New Roman" w:cs="Times New Roman"/>
-                <w:color w:val="000000"/>
-                <w:kern w:val="0"/>
-                <w:sz w:val="18"/>
-                <w:szCs w:val="18"/>
-                <w:lang w:eastAsia="en-IN"/>
-                <w14:ligatures w14:val="none"/>
-              </w:rPr>
-            </w:pPr>
-            <w:r>
-              <w:rPr>
-                <w:rFonts w:ascii="Times New Roman" w:eastAsia="Times New Roman" w:hAnsi="Times New Roman" w:cs="Times New Roman"/>
-                <w:color w:val="000000"/>
+                <w:color w:val="EE0000"/>
+                <w:kern w:val="0"/>
+                <w:sz w:val="18"/>
+                <w:szCs w:val="18"/>
+                <w:lang w:eastAsia="en-IN"/>
+                <w14:ligatures w14:val="none"/>
+              </w:rPr>
+            </w:pPr>
+            <w:r>
+              <w:rPr>
+                <w:rFonts w:ascii="Times New Roman" w:eastAsia="Times New Roman" w:hAnsi="Times New Roman" w:cs="Times New Roman"/>
+                <w:color w:val="EE0000"/>
                 <w:kern w:val="0"/>
                 <w:sz w:val="18"/>
                 <w:szCs w:val="18"/>
@@ -3737,18 +3737,18 @@
               <w:jc w:val="center"/>
               <w:rPr>
                 <w:rFonts w:ascii="Times New Roman" w:eastAsia="Times New Roman" w:hAnsi="Times New Roman" w:cs="Times New Roman"/>
-                <w:color w:val="000000"/>
-                <w:kern w:val="0"/>
-                <w:sz w:val="18"/>
-                <w:szCs w:val="18"/>
-                <w:lang w:eastAsia="en-IN"/>
-                <w14:ligatures w14:val="none"/>
-              </w:rPr>
-            </w:pPr>
-            <w:r>
-              <w:rPr>
-                <w:rFonts w:ascii="Times New Roman" w:eastAsia="Times New Roman" w:hAnsi="Times New Roman" w:cs="Times New Roman"/>
-                <w:color w:val="000000"/>
+                <w:color w:val="EE0000"/>
+                <w:kern w:val="0"/>
+                <w:sz w:val="18"/>
+                <w:szCs w:val="18"/>
+                <w:lang w:eastAsia="en-IN"/>
+                <w14:ligatures w14:val="none"/>
+              </w:rPr>
+            </w:pPr>
+            <w:r>
+              <w:rPr>
+                <w:rFonts w:ascii="Times New Roman" w:eastAsia="Times New Roman" w:hAnsi="Times New Roman" w:cs="Times New Roman"/>
+                <w:color w:val="EE0000"/>
                 <w:kern w:val="0"/>
                 <w:sz w:val="18"/>
                 <w:szCs w:val="18"/>
@@ -3906,18 +3906,18 @@
               <w:jc w:val="center"/>
               <w:rPr>
                 <w:rFonts w:ascii="Times New Roman" w:eastAsia="Times New Roman" w:hAnsi="Times New Roman" w:cs="Times New Roman"/>
-                <w:color w:val="000000"/>
-                <w:kern w:val="0"/>
-                <w:sz w:val="18"/>
-                <w:szCs w:val="18"/>
-                <w:lang w:eastAsia="en-IN"/>
-                <w14:ligatures w14:val="none"/>
-              </w:rPr>
-            </w:pPr>
-            <w:r>
-              <w:rPr>
-                <w:rFonts w:ascii="Times New Roman" w:eastAsia="Times New Roman" w:hAnsi="Times New Roman" w:cs="Times New Roman"/>
-                <w:color w:val="000000"/>
+                <w:color w:val="EE0000"/>
+                <w:kern w:val="0"/>
+                <w:sz w:val="18"/>
+                <w:szCs w:val="18"/>
+                <w:lang w:eastAsia="en-IN"/>
+                <w14:ligatures w14:val="none"/>
+              </w:rPr>
+            </w:pPr>
+            <w:r>
+              <w:rPr>
+                <w:rFonts w:ascii="Times New Roman" w:eastAsia="Times New Roman" w:hAnsi="Times New Roman" w:cs="Times New Roman"/>
+                <w:color w:val="EE0000"/>
                 <w:kern w:val="0"/>
                 <w:sz w:val="18"/>
                 <w:szCs w:val="18"/>
@@ -4075,18 +4075,18 @@
               <w:jc w:val="center"/>
               <w:rPr>
                 <w:rFonts w:ascii="Times New Roman" w:eastAsia="Times New Roman" w:hAnsi="Times New Roman" w:cs="Times New Roman"/>
-                <w:color w:val="000000"/>
-                <w:kern w:val="0"/>
-                <w:sz w:val="18"/>
-                <w:szCs w:val="18"/>
-                <w:lang w:eastAsia="en-IN"/>
-                <w14:ligatures w14:val="none"/>
-              </w:rPr>
-            </w:pPr>
-            <w:r>
-              <w:rPr>
-                <w:rFonts w:ascii="Times New Roman" w:eastAsia="Times New Roman" w:hAnsi="Times New Roman" w:cs="Times New Roman"/>
-                <w:color w:val="000000"/>
+                <w:color w:val="EE0000"/>
+                <w:kern w:val="0"/>
+                <w:sz w:val="18"/>
+                <w:szCs w:val="18"/>
+                <w:lang w:eastAsia="en-IN"/>
+                <w14:ligatures w14:val="none"/>
+              </w:rPr>
+            </w:pPr>
+            <w:r>
+              <w:rPr>
+                <w:rFonts w:ascii="Times New Roman" w:eastAsia="Times New Roman" w:hAnsi="Times New Roman" w:cs="Times New Roman"/>
+                <w:color w:val="EE0000"/>
                 <w:kern w:val="0"/>
                 <w:sz w:val="18"/>
                 <w:szCs w:val="18"/>
@@ -4244,18 +4244,18 @@
               <w:jc w:val="center"/>
               <w:rPr>
                 <w:rFonts w:ascii="Times New Roman" w:eastAsia="Times New Roman" w:hAnsi="Times New Roman" w:cs="Times New Roman"/>
-                <w:color w:val="000000"/>
-                <w:kern w:val="0"/>
-                <w:sz w:val="18"/>
-                <w:szCs w:val="18"/>
-                <w:lang w:eastAsia="en-IN"/>
-                <w14:ligatures w14:val="none"/>
-              </w:rPr>
-            </w:pPr>
-            <w:r>
-              <w:rPr>
-                <w:rFonts w:ascii="Times New Roman" w:eastAsia="Times New Roman" w:hAnsi="Times New Roman" w:cs="Times New Roman"/>
-                <w:color w:val="000000"/>
+                <w:color w:val="EE0000"/>
+                <w:kern w:val="0"/>
+                <w:sz w:val="18"/>
+                <w:szCs w:val="18"/>
+                <w:lang w:eastAsia="en-IN"/>
+                <w14:ligatures w14:val="none"/>
+              </w:rPr>
+            </w:pPr>
+            <w:r>
+              <w:rPr>
+                <w:rFonts w:ascii="Times New Roman" w:eastAsia="Times New Roman" w:hAnsi="Times New Roman" w:cs="Times New Roman"/>
+                <w:color w:val="EE0000"/>
                 <w:kern w:val="0"/>
                 <w:sz w:val="18"/>
                 <w:szCs w:val="18"/>
@@ -4426,18 +4426,18 @@
               <w:jc w:val="center"/>
               <w:rPr>
                 <w:rFonts w:ascii="Times New Roman" w:eastAsia="Times New Roman" w:hAnsi="Times New Roman" w:cs="Times New Roman"/>
-                <w:color w:val="000000"/>
-                <w:kern w:val="0"/>
-                <w:sz w:val="18"/>
-                <w:szCs w:val="18"/>
-                <w:lang w:eastAsia="en-IN"/>
-                <w14:ligatures w14:val="none"/>
-              </w:rPr>
-            </w:pPr>
-            <w:r>
-              <w:rPr>
-                <w:rFonts w:ascii="Times New Roman" w:eastAsia="Times New Roman" w:hAnsi="Times New Roman" w:cs="Times New Roman"/>
-                <w:color w:val="000000"/>
+                <w:color w:val="EE0000"/>
+                <w:kern w:val="0"/>
+                <w:sz w:val="18"/>
+                <w:szCs w:val="18"/>
+                <w:lang w:eastAsia="en-IN"/>
+                <w14:ligatures w14:val="none"/>
+              </w:rPr>
+            </w:pPr>
+            <w:r>
+              <w:rPr>
+                <w:rFonts w:ascii="Times New Roman" w:eastAsia="Times New Roman" w:hAnsi="Times New Roman" w:cs="Times New Roman"/>
+                <w:color w:val="EE0000"/>
                 <w:kern w:val="0"/>
                 <w:sz w:val="18"/>
                 <w:szCs w:val="18"/>
@@ -4595,18 +4595,18 @@
               <w:jc w:val="center"/>
               <w:rPr>
                 <w:rFonts w:ascii="Times New Roman" w:eastAsia="Times New Roman" w:hAnsi="Times New Roman" w:cs="Times New Roman"/>
-                <w:color w:val="000000"/>
-                <w:kern w:val="0"/>
-                <w:sz w:val="18"/>
-                <w:szCs w:val="18"/>
-                <w:lang w:eastAsia="en-IN"/>
-                <w14:ligatures w14:val="none"/>
-              </w:rPr>
-            </w:pPr>
-            <w:r>
-              <w:rPr>
-                <w:rFonts w:ascii="Times New Roman" w:eastAsia="Times New Roman" w:hAnsi="Times New Roman" w:cs="Times New Roman"/>
-                <w:color w:val="000000"/>
+                <w:color w:val="EE0000"/>
+                <w:kern w:val="0"/>
+                <w:sz w:val="18"/>
+                <w:szCs w:val="18"/>
+                <w:lang w:eastAsia="en-IN"/>
+                <w14:ligatures w14:val="none"/>
+              </w:rPr>
+            </w:pPr>
+            <w:r>
+              <w:rPr>
+                <w:rFonts w:ascii="Times New Roman" w:eastAsia="Times New Roman" w:hAnsi="Times New Roman" w:cs="Times New Roman"/>
+                <w:color w:val="EE0000"/>
                 <w:kern w:val="0"/>
                 <w:sz w:val="18"/>
                 <w:szCs w:val="18"/>
@@ -4777,18 +4777,18 @@
               <w:jc w:val="center"/>
               <w:rPr>
                 <w:rFonts w:ascii="Times New Roman" w:eastAsia="Times New Roman" w:hAnsi="Times New Roman" w:cs="Times New Roman"/>
-                <w:color w:val="000000"/>
-                <w:kern w:val="0"/>
-                <w:sz w:val="18"/>
-                <w:szCs w:val="18"/>
-                <w:lang w:eastAsia="en-IN"/>
-                <w14:ligatures w14:val="none"/>
-              </w:rPr>
-            </w:pPr>
-            <w:r>
-              <w:rPr>
-                <w:rFonts w:ascii="Times New Roman" w:eastAsia="Times New Roman" w:hAnsi="Times New Roman" w:cs="Times New Roman"/>
-                <w:color w:val="000000"/>
+                <w:color w:val="EE0000"/>
+                <w:kern w:val="0"/>
+                <w:sz w:val="18"/>
+                <w:szCs w:val="18"/>
+                <w:lang w:eastAsia="en-IN"/>
+                <w14:ligatures w14:val="none"/>
+              </w:rPr>
+            </w:pPr>
+            <w:r>
+              <w:rPr>
+                <w:rFonts w:ascii="Times New Roman" w:eastAsia="Times New Roman" w:hAnsi="Times New Roman" w:cs="Times New Roman"/>
+                <w:color w:val="EE0000"/>
                 <w:kern w:val="0"/>
                 <w:sz w:val="18"/>
                 <w:szCs w:val="18"/>
@@ -4946,18 +4946,18 @@
               <w:jc w:val="center"/>
               <w:rPr>
                 <w:rFonts w:ascii="Times New Roman" w:eastAsia="Times New Roman" w:hAnsi="Times New Roman" w:cs="Times New Roman"/>
-                <w:color w:val="000000"/>
-                <w:kern w:val="0"/>
-                <w:sz w:val="18"/>
-                <w:szCs w:val="18"/>
-                <w:lang w:eastAsia="en-IN"/>
-                <w14:ligatures w14:val="none"/>
-              </w:rPr>
-            </w:pPr>
-            <w:r>
-              <w:rPr>
-                <w:rFonts w:ascii="Times New Roman" w:eastAsia="Times New Roman" w:hAnsi="Times New Roman" w:cs="Times New Roman"/>
-                <w:color w:val="000000"/>
+                <w:color w:val="EE0000"/>
+                <w:kern w:val="0"/>
+                <w:sz w:val="18"/>
+                <w:szCs w:val="18"/>
+                <w:lang w:eastAsia="en-IN"/>
+                <w14:ligatures w14:val="none"/>
+              </w:rPr>
+            </w:pPr>
+            <w:r>
+              <w:rPr>
+                <w:rFonts w:ascii="Times New Roman" w:eastAsia="Times New Roman" w:hAnsi="Times New Roman" w:cs="Times New Roman"/>
+                <w:color w:val="EE0000"/>
                 <w:kern w:val="0"/>
                 <w:sz w:val="18"/>
                 <w:szCs w:val="18"/>
@@ -5117,18 +5117,18 @@
               <w:jc w:val="center"/>
               <w:rPr>
                 <w:rFonts w:ascii="Times New Roman" w:eastAsia="Times New Roman" w:hAnsi="Times New Roman" w:cs="Times New Roman"/>
-                <w:color w:val="000000"/>
-                <w:kern w:val="0"/>
-                <w:sz w:val="18"/>
-                <w:szCs w:val="18"/>
-                <w:lang w:eastAsia="en-IN"/>
-                <w14:ligatures w14:val="none"/>
-              </w:rPr>
-            </w:pPr>
-            <w:r>
-              <w:rPr>
-                <w:rFonts w:ascii="Times New Roman" w:eastAsia="Times New Roman" w:hAnsi="Times New Roman" w:cs="Times New Roman"/>
-                <w:color w:val="000000"/>
+                <w:color w:val="EE0000"/>
+                <w:kern w:val="0"/>
+                <w:sz w:val="18"/>
+                <w:szCs w:val="18"/>
+                <w:lang w:eastAsia="en-IN"/>
+                <w14:ligatures w14:val="none"/>
+              </w:rPr>
+            </w:pPr>
+            <w:r>
+              <w:rPr>
+                <w:rFonts w:ascii="Times New Roman" w:eastAsia="Times New Roman" w:hAnsi="Times New Roman" w:cs="Times New Roman"/>
+                <w:color w:val="EE0000"/>
                 <w:kern w:val="0"/>
                 <w:sz w:val="18"/>
                 <w:szCs w:val="18"/>
@@ -5286,18 +5286,18 @@
               <w:jc w:val="center"/>
               <w:rPr>
                 <w:rFonts w:ascii="Times New Roman" w:eastAsia="Times New Roman" w:hAnsi="Times New Roman" w:cs="Times New Roman"/>
-                <w:color w:val="000000"/>
-                <w:kern w:val="0"/>
-                <w:sz w:val="18"/>
-                <w:szCs w:val="18"/>
-                <w:lang w:eastAsia="en-IN"/>
-                <w14:ligatures w14:val="none"/>
-              </w:rPr>
-            </w:pPr>
-            <w:r>
-              <w:rPr>
-                <w:rFonts w:ascii="Times New Roman" w:eastAsia="Times New Roman" w:hAnsi="Times New Roman" w:cs="Times New Roman"/>
-                <w:color w:val="000000"/>
+                <w:color w:val="EE0000"/>
+                <w:kern w:val="0"/>
+                <w:sz w:val="18"/>
+                <w:szCs w:val="18"/>
+                <w:lang w:eastAsia="en-IN"/>
+                <w14:ligatures w14:val="none"/>
+              </w:rPr>
+            </w:pPr>
+            <w:r>
+              <w:rPr>
+                <w:rFonts w:ascii="Times New Roman" w:eastAsia="Times New Roman" w:hAnsi="Times New Roman" w:cs="Times New Roman"/>
+                <w:color w:val="EE0000"/>
                 <w:kern w:val="0"/>
                 <w:sz w:val="18"/>
                 <w:szCs w:val="18"/>
@@ -5455,18 +5455,18 @@
               <w:jc w:val="center"/>
               <w:rPr>
                 <w:rFonts w:ascii="Times New Roman" w:eastAsia="Times New Roman" w:hAnsi="Times New Roman" w:cs="Times New Roman"/>
-                <w:color w:val="000000"/>
-                <w:kern w:val="0"/>
-                <w:sz w:val="18"/>
-                <w:szCs w:val="18"/>
-                <w:lang w:eastAsia="en-IN"/>
-                <w14:ligatures w14:val="none"/>
-              </w:rPr>
-            </w:pPr>
-            <w:r>
-              <w:rPr>
-                <w:rFonts w:ascii="Times New Roman" w:eastAsia="Times New Roman" w:hAnsi="Times New Roman" w:cs="Times New Roman"/>
-                <w:color w:val="000000"/>
+                <w:color w:val="EE0000"/>
+                <w:kern w:val="0"/>
+                <w:sz w:val="18"/>
+                <w:szCs w:val="18"/>
+                <w:lang w:eastAsia="en-IN"/>
+                <w14:ligatures w14:val="none"/>
+              </w:rPr>
+            </w:pPr>
+            <w:r>
+              <w:rPr>
+                <w:rFonts w:ascii="Times New Roman" w:eastAsia="Times New Roman" w:hAnsi="Times New Roman" w:cs="Times New Roman"/>
+                <w:color w:val="EE0000"/>
                 <w:kern w:val="0"/>
                 <w:sz w:val="18"/>
                 <w:szCs w:val="18"/>
@@ -5650,18 +5650,18 @@
               <w:jc w:val="center"/>
               <w:rPr>
                 <w:rFonts w:ascii="Times New Roman" w:eastAsia="Times New Roman" w:hAnsi="Times New Roman" w:cs="Times New Roman"/>
-                <w:color w:val="000000"/>
-                <w:kern w:val="0"/>
-                <w:sz w:val="18"/>
-                <w:szCs w:val="18"/>
-                <w:lang w:eastAsia="en-IN"/>
-                <w14:ligatures w14:val="none"/>
-              </w:rPr>
-            </w:pPr>
-            <w:r>
-              <w:rPr>
-                <w:rFonts w:ascii="Times New Roman" w:eastAsia="Times New Roman" w:hAnsi="Times New Roman" w:cs="Times New Roman"/>
-                <w:color w:val="000000"/>
+                <w:color w:val="EE0000"/>
+                <w:kern w:val="0"/>
+                <w:sz w:val="18"/>
+                <w:szCs w:val="18"/>
+                <w:lang w:eastAsia="en-IN"/>
+                <w14:ligatures w14:val="none"/>
+              </w:rPr>
+            </w:pPr>
+            <w:r>
+              <w:rPr>
+                <w:rFonts w:ascii="Times New Roman" w:eastAsia="Times New Roman" w:hAnsi="Times New Roman" w:cs="Times New Roman"/>
+                <w:color w:val="EE0000"/>
                 <w:kern w:val="0"/>
                 <w:sz w:val="18"/>
                 <w:szCs w:val="18"/>
@@ -5981,18 +5981,18 @@
               <w:jc w:val="center"/>
               <w:rPr>
                 <w:rFonts w:ascii="Times New Roman" w:eastAsia="Times New Roman" w:hAnsi="Times New Roman" w:cs="Times New Roman"/>
-                <w:color w:val="000000"/>
-                <w:kern w:val="0"/>
-                <w:sz w:val="18"/>
-                <w:szCs w:val="18"/>
-                <w:lang w:eastAsia="en-IN"/>
-                <w14:ligatures w14:val="none"/>
-              </w:rPr>
-            </w:pPr>
-            <w:r>
-              <w:rPr>
-                <w:rFonts w:ascii="Times New Roman" w:eastAsia="Times New Roman" w:hAnsi="Times New Roman" w:cs="Times New Roman"/>
-                <w:color w:val="000000"/>
+                <w:color w:val="EE0000"/>
+                <w:kern w:val="0"/>
+                <w:sz w:val="18"/>
+                <w:szCs w:val="18"/>
+                <w:lang w:eastAsia="en-IN"/>
+                <w14:ligatures w14:val="none"/>
+              </w:rPr>
+            </w:pPr>
+            <w:r>
+              <w:rPr>
+                <w:rFonts w:ascii="Times New Roman" w:eastAsia="Times New Roman" w:hAnsi="Times New Roman" w:cs="Times New Roman"/>
+                <w:color w:val="EE0000"/>
                 <w:kern w:val="0"/>
                 <w:sz w:val="18"/>
                 <w:szCs w:val="18"/>
@@ -6150,18 +6150,18 @@
               <w:jc w:val="center"/>
               <w:rPr>
                 <w:rFonts w:ascii="Times New Roman" w:eastAsia="Times New Roman" w:hAnsi="Times New Roman" w:cs="Times New Roman"/>
-                <w:color w:val="000000"/>
-                <w:kern w:val="0"/>
-                <w:sz w:val="18"/>
-                <w:szCs w:val="18"/>
-                <w:lang w:eastAsia="en-IN"/>
-                <w14:ligatures w14:val="none"/>
-              </w:rPr>
-            </w:pPr>
-            <w:r>
-              <w:rPr>
-                <w:rFonts w:ascii="Times New Roman" w:eastAsia="Times New Roman" w:hAnsi="Times New Roman" w:cs="Times New Roman"/>
-                <w:color w:val="000000"/>
+                <w:color w:val="EE0000"/>
+                <w:kern w:val="0"/>
+                <w:sz w:val="18"/>
+                <w:szCs w:val="18"/>
+                <w:lang w:eastAsia="en-IN"/>
+                <w14:ligatures w14:val="none"/>
+              </w:rPr>
+            </w:pPr>
+            <w:r>
+              <w:rPr>
+                <w:rFonts w:ascii="Times New Roman" w:eastAsia="Times New Roman" w:hAnsi="Times New Roman" w:cs="Times New Roman"/>
+                <w:color w:val="EE0000"/>
                 <w:kern w:val="0"/>
                 <w:sz w:val="18"/>
                 <w:szCs w:val="18"/>
@@ -6345,18 +6345,18 @@
               <w:jc w:val="center"/>
               <w:rPr>
                 <w:rFonts w:ascii="Times New Roman" w:eastAsia="Times New Roman" w:hAnsi="Times New Roman" w:cs="Times New Roman"/>
-                <w:color w:val="000000"/>
-                <w:kern w:val="0"/>
-                <w:sz w:val="18"/>
-                <w:szCs w:val="18"/>
-                <w:lang w:eastAsia="en-IN"/>
-                <w14:ligatures w14:val="none"/>
-              </w:rPr>
-            </w:pPr>
-            <w:r>
-              <w:rPr>
-                <w:rFonts w:ascii="Times New Roman" w:eastAsia="Times New Roman" w:hAnsi="Times New Roman" w:cs="Times New Roman"/>
-                <w:color w:val="000000"/>
+                <w:color w:val="EE0000"/>
+                <w:kern w:val="0"/>
+                <w:sz w:val="18"/>
+                <w:szCs w:val="18"/>
+                <w:lang w:eastAsia="en-IN"/>
+                <w14:ligatures w14:val="none"/>
+              </w:rPr>
+            </w:pPr>
+            <w:r>
+              <w:rPr>
+                <w:rFonts w:ascii="Times New Roman" w:eastAsia="Times New Roman" w:hAnsi="Times New Roman" w:cs="Times New Roman"/>
+                <w:color w:val="EE0000"/>
                 <w:kern w:val="0"/>
                 <w:sz w:val="18"/>
                 <w:szCs w:val="18"/>
@@ -6540,18 +6540,18 @@
               <w:jc w:val="center"/>
               <w:rPr>
                 <w:rFonts w:ascii="Times New Roman" w:eastAsia="Times New Roman" w:hAnsi="Times New Roman" w:cs="Times New Roman"/>
-                <w:color w:val="000000"/>
-                <w:kern w:val="0"/>
-                <w:sz w:val="18"/>
-                <w:szCs w:val="18"/>
-                <w:lang w:eastAsia="en-IN"/>
-                <w14:ligatures w14:val="none"/>
-              </w:rPr>
-            </w:pPr>
-            <w:r>
-              <w:rPr>
-                <w:rFonts w:ascii="Times New Roman" w:eastAsia="Times New Roman" w:hAnsi="Times New Roman" w:cs="Times New Roman"/>
-                <w:color w:val="000000"/>
+                <w:color w:val="EE0000"/>
+                <w:kern w:val="0"/>
+                <w:sz w:val="18"/>
+                <w:szCs w:val="18"/>
+                <w:lang w:eastAsia="en-IN"/>
+                <w14:ligatures w14:val="none"/>
+              </w:rPr>
+            </w:pPr>
+            <w:r>
+              <w:rPr>
+                <w:rFonts w:ascii="Times New Roman" w:eastAsia="Times New Roman" w:hAnsi="Times New Roman" w:cs="Times New Roman"/>
+                <w:color w:val="EE0000"/>
                 <w:kern w:val="0"/>
                 <w:sz w:val="18"/>
                 <w:szCs w:val="18"/>
@@ -6709,18 +6709,18 @@
               <w:jc w:val="center"/>
               <w:rPr>
                 <w:rFonts w:ascii="Times New Roman" w:eastAsia="Times New Roman" w:hAnsi="Times New Roman" w:cs="Times New Roman"/>
-                <w:color w:val="000000"/>
-                <w:kern w:val="0"/>
-                <w:sz w:val="18"/>
-                <w:szCs w:val="18"/>
-                <w:lang w:eastAsia="en-IN"/>
-                <w14:ligatures w14:val="none"/>
-              </w:rPr>
-            </w:pPr>
-            <w:r>
-              <w:rPr>
-                <w:rFonts w:ascii="Times New Roman" w:eastAsia="Times New Roman" w:hAnsi="Times New Roman" w:cs="Times New Roman"/>
-                <w:color w:val="000000"/>
+                <w:color w:val="EE0000"/>
+                <w:kern w:val="0"/>
+                <w:sz w:val="18"/>
+                <w:szCs w:val="18"/>
+                <w:lang w:eastAsia="en-IN"/>
+                <w14:ligatures w14:val="none"/>
+              </w:rPr>
+            </w:pPr>
+            <w:r>
+              <w:rPr>
+                <w:rFonts w:ascii="Times New Roman" w:eastAsia="Times New Roman" w:hAnsi="Times New Roman" w:cs="Times New Roman"/>
+                <w:color w:val="EE0000"/>
                 <w:kern w:val="0"/>
                 <w:sz w:val="18"/>
                 <w:szCs w:val="18"/>
@@ -7026,18 +7026,18 @@
               <w:jc w:val="center"/>
               <w:rPr>
                 <w:rFonts w:ascii="Times New Roman" w:eastAsia="Times New Roman" w:hAnsi="Times New Roman" w:cs="Times New Roman"/>
-                <w:color w:val="000000"/>
-                <w:kern w:val="0"/>
-                <w:sz w:val="18"/>
-                <w:szCs w:val="18"/>
-                <w:lang w:eastAsia="en-IN"/>
-                <w14:ligatures w14:val="none"/>
-              </w:rPr>
-            </w:pPr>
-            <w:r>
-              <w:rPr>
-                <w:rFonts w:ascii="Times New Roman" w:eastAsia="Times New Roman" w:hAnsi="Times New Roman" w:cs="Times New Roman"/>
-                <w:color w:val="000000"/>
+                <w:color w:val="EE0000"/>
+                <w:kern w:val="0"/>
+                <w:sz w:val="18"/>
+                <w:szCs w:val="18"/>
+                <w:lang w:eastAsia="en-IN"/>
+                <w14:ligatures w14:val="none"/>
+              </w:rPr>
+            </w:pPr>
+            <w:r>
+              <w:rPr>
+                <w:rFonts w:ascii="Times New Roman" w:eastAsia="Times New Roman" w:hAnsi="Times New Roman" w:cs="Times New Roman"/>
+                <w:color w:val="EE0000"/>
                 <w:kern w:val="0"/>
                 <w:sz w:val="18"/>
                 <w:szCs w:val="18"/>
@@ -7195,18 +7195,18 @@
               <w:jc w:val="center"/>
               <w:rPr>
                 <w:rFonts w:ascii="Times New Roman" w:eastAsia="Times New Roman" w:hAnsi="Times New Roman" w:cs="Times New Roman"/>
-                <w:color w:val="000000"/>
-                <w:kern w:val="0"/>
-                <w:sz w:val="18"/>
-                <w:szCs w:val="18"/>
-                <w:lang w:eastAsia="en-IN"/>
-                <w14:ligatures w14:val="none"/>
-              </w:rPr>
-            </w:pPr>
-            <w:r>
-              <w:rPr>
-                <w:rFonts w:ascii="Times New Roman" w:eastAsia="Times New Roman" w:hAnsi="Times New Roman" w:cs="Times New Roman"/>
-                <w:color w:val="000000"/>
+                <w:color w:val="EE0000"/>
+                <w:kern w:val="0"/>
+                <w:sz w:val="18"/>
+                <w:szCs w:val="18"/>
+                <w:lang w:eastAsia="en-IN"/>
+                <w14:ligatures w14:val="none"/>
+              </w:rPr>
+            </w:pPr>
+            <w:r>
+              <w:rPr>
+                <w:rFonts w:ascii="Times New Roman" w:eastAsia="Times New Roman" w:hAnsi="Times New Roman" w:cs="Times New Roman"/>
+                <w:color w:val="EE0000"/>
                 <w:kern w:val="0"/>
                 <w:sz w:val="18"/>
                 <w:szCs w:val="18"/>
@@ -7376,7 +7376,7 @@
             <w:r>
               <w:rPr>
                 <w:rFonts w:ascii="Times New Roman" w:eastAsia="Times New Roman" w:hAnsi="Times New Roman" w:cs="Times New Roman"/>
-                <w:color w:val="000000"/>
+                <w:color w:val="EE0000"/>
                 <w:kern w:val="0"/>
                 <w:sz w:val="18"/>
                 <w:szCs w:val="18"/>
@@ -7682,18 +7682,18 @@
               <w:jc w:val="center"/>
               <w:rPr>
                 <w:rFonts w:ascii="Times New Roman" w:eastAsia="Times New Roman" w:hAnsi="Times New Roman" w:cs="Times New Roman"/>
-                <w:color w:val="000000"/>
-                <w:kern w:val="0"/>
-                <w:sz w:val="18"/>
-                <w:szCs w:val="18"/>
-                <w:lang w:eastAsia="en-IN"/>
-                <w14:ligatures w14:val="none"/>
-              </w:rPr>
-            </w:pPr>
-            <w:r>
-              <w:rPr>
-                <w:rFonts w:ascii="Times New Roman" w:eastAsia="Times New Roman" w:hAnsi="Times New Roman" w:cs="Times New Roman"/>
-                <w:color w:val="000000"/>
+                <w:color w:val="EE0000"/>
+                <w:kern w:val="0"/>
+                <w:sz w:val="18"/>
+                <w:szCs w:val="18"/>
+                <w:lang w:eastAsia="en-IN"/>
+                <w14:ligatures w14:val="none"/>
+              </w:rPr>
+            </w:pPr>
+            <w:r>
+              <w:rPr>
+                <w:rFonts w:ascii="Times New Roman" w:eastAsia="Times New Roman" w:hAnsi="Times New Roman" w:cs="Times New Roman"/>
+                <w:color w:val="EE0000"/>
                 <w:kern w:val="0"/>
                 <w:sz w:val="18"/>
                 <w:szCs w:val="18"/>
@@ -7851,18 +7851,18 @@
               <w:jc w:val="center"/>
               <w:rPr>
                 <w:rFonts w:ascii="Times New Roman" w:eastAsia="Times New Roman" w:hAnsi="Times New Roman" w:cs="Times New Roman"/>
-                <w:color w:val="000000"/>
-                <w:kern w:val="0"/>
-                <w:sz w:val="18"/>
-                <w:szCs w:val="18"/>
-                <w:lang w:eastAsia="en-IN"/>
-                <w14:ligatures w14:val="none"/>
-              </w:rPr>
-            </w:pPr>
-            <w:r>
-              <w:rPr>
-                <w:rFonts w:ascii="Times New Roman" w:eastAsia="Times New Roman" w:hAnsi="Times New Roman" w:cs="Times New Roman"/>
-                <w:color w:val="000000"/>
+                <w:color w:val="EE0000"/>
+                <w:kern w:val="0"/>
+                <w:sz w:val="18"/>
+                <w:szCs w:val="18"/>
+                <w:lang w:eastAsia="en-IN"/>
+                <w14:ligatures w14:val="none"/>
+              </w:rPr>
+            </w:pPr>
+            <w:r>
+              <w:rPr>
+                <w:rFonts w:ascii="Times New Roman" w:eastAsia="Times New Roman" w:hAnsi="Times New Roman" w:cs="Times New Roman"/>
+                <w:color w:val="EE0000"/>
                 <w:kern w:val="0"/>
                 <w:sz w:val="18"/>
                 <w:szCs w:val="18"/>
@@ -8020,18 +8020,18 @@
               <w:jc w:val="center"/>
               <w:rPr>
                 <w:rFonts w:ascii="Times New Roman" w:eastAsia="Times New Roman" w:hAnsi="Times New Roman" w:cs="Times New Roman"/>
-                <w:color w:val="000000"/>
-                <w:kern w:val="0"/>
-                <w:sz w:val="18"/>
-                <w:szCs w:val="18"/>
-                <w:lang w:eastAsia="en-IN"/>
-                <w14:ligatures w14:val="none"/>
-              </w:rPr>
-            </w:pPr>
-            <w:r>
-              <w:rPr>
-                <w:rFonts w:ascii="Times New Roman" w:eastAsia="Times New Roman" w:hAnsi="Times New Roman" w:cs="Times New Roman"/>
-                <w:color w:val="000000"/>
+                <w:color w:val="EE0000"/>
+                <w:kern w:val="0"/>
+                <w:sz w:val="18"/>
+                <w:szCs w:val="18"/>
+                <w:lang w:eastAsia="en-IN"/>
+                <w14:ligatures w14:val="none"/>
+              </w:rPr>
+            </w:pPr>
+            <w:r>
+              <w:rPr>
+                <w:rFonts w:ascii="Times New Roman" w:eastAsia="Times New Roman" w:hAnsi="Times New Roman" w:cs="Times New Roman"/>
+                <w:color w:val="EE0000"/>
                 <w:kern w:val="0"/>
                 <w:sz w:val="18"/>
                 <w:szCs w:val="18"/>
@@ -8363,18 +8363,18 @@
               <w:jc w:val="center"/>
               <w:rPr>
                 <w:rFonts w:ascii="Times New Roman" w:eastAsia="Times New Roman" w:hAnsi="Times New Roman" w:cs="Times New Roman"/>
-                <w:color w:val="000000"/>
-                <w:kern w:val="0"/>
-                <w:sz w:val="18"/>
-                <w:szCs w:val="18"/>
-                <w:lang w:eastAsia="en-IN"/>
-                <w14:ligatures w14:val="none"/>
-              </w:rPr>
-            </w:pPr>
-            <w:r>
-              <w:rPr>
-                <w:rFonts w:ascii="Times New Roman" w:eastAsia="Times New Roman" w:hAnsi="Times New Roman" w:cs="Times New Roman"/>
-                <w:color w:val="000000"/>
+                <w:color w:val="EE0000"/>
+                <w:kern w:val="0"/>
+                <w:sz w:val="18"/>
+                <w:szCs w:val="18"/>
+                <w:lang w:eastAsia="en-IN"/>
+                <w14:ligatures w14:val="none"/>
+              </w:rPr>
+            </w:pPr>
+            <w:r>
+              <w:rPr>
+                <w:rFonts w:ascii="Times New Roman" w:eastAsia="Times New Roman" w:hAnsi="Times New Roman" w:cs="Times New Roman"/>
+                <w:color w:val="EE0000"/>
                 <w:kern w:val="0"/>
                 <w:sz w:val="18"/>
                 <w:szCs w:val="18"/>
@@ -8532,18 +8532,18 @@
               <w:jc w:val="center"/>
               <w:rPr>
                 <w:rFonts w:ascii="Times New Roman" w:eastAsia="Times New Roman" w:hAnsi="Times New Roman" w:cs="Times New Roman"/>
-                <w:color w:val="000000"/>
-                <w:kern w:val="0"/>
-                <w:sz w:val="18"/>
-                <w:szCs w:val="18"/>
-                <w:lang w:eastAsia="en-IN"/>
-                <w14:ligatures w14:val="none"/>
-              </w:rPr>
-            </w:pPr>
-            <w:r>
-              <w:rPr>
-                <w:rFonts w:ascii="Times New Roman" w:eastAsia="Times New Roman" w:hAnsi="Times New Roman" w:cs="Times New Roman"/>
-                <w:color w:val="000000"/>
+                <w:color w:val="EE0000"/>
+                <w:kern w:val="0"/>
+                <w:sz w:val="18"/>
+                <w:szCs w:val="18"/>
+                <w:lang w:eastAsia="en-IN"/>
+                <w14:ligatures w14:val="none"/>
+              </w:rPr>
+            </w:pPr>
+            <w:r>
+              <w:rPr>
+                <w:rFonts w:ascii="Times New Roman" w:eastAsia="Times New Roman" w:hAnsi="Times New Roman" w:cs="Times New Roman"/>
+                <w:color w:val="EE0000"/>
                 <w:kern w:val="0"/>
                 <w:sz w:val="18"/>
                 <w:szCs w:val="18"/>
@@ -8849,18 +8849,18 @@
               <w:jc w:val="center"/>
               <w:rPr>
                 <w:rFonts w:ascii="Times New Roman" w:eastAsia="Times New Roman" w:hAnsi="Times New Roman" w:cs="Times New Roman"/>
-                <w:color w:val="000000"/>
-                <w:kern w:val="0"/>
-                <w:sz w:val="18"/>
-                <w:szCs w:val="18"/>
-                <w:lang w:eastAsia="en-IN"/>
-                <w14:ligatures w14:val="none"/>
-              </w:rPr>
-            </w:pPr>
-            <w:r>
-              <w:rPr>
-                <w:rFonts w:ascii="Times New Roman" w:eastAsia="Times New Roman" w:hAnsi="Times New Roman" w:cs="Times New Roman"/>
-                <w:color w:val="000000"/>
+                <w:color w:val="EE0000"/>
+                <w:kern w:val="0"/>
+                <w:sz w:val="18"/>
+                <w:szCs w:val="18"/>
+                <w:lang w:eastAsia="en-IN"/>
+                <w14:ligatures w14:val="none"/>
+              </w:rPr>
+            </w:pPr>
+            <w:r>
+              <w:rPr>
+                <w:rFonts w:ascii="Times New Roman" w:eastAsia="Times New Roman" w:hAnsi="Times New Roman" w:cs="Times New Roman"/>
+                <w:color w:val="EE0000"/>
                 <w:kern w:val="0"/>
                 <w:sz w:val="18"/>
                 <w:szCs w:val="18"/>
@@ -9018,18 +9018,18 @@
               <w:jc w:val="center"/>
               <w:rPr>
                 <w:rFonts w:ascii="Times New Roman" w:eastAsia="Times New Roman" w:hAnsi="Times New Roman" w:cs="Times New Roman"/>
-                <w:color w:val="000000"/>
-                <w:kern w:val="0"/>
-                <w:sz w:val="18"/>
-                <w:szCs w:val="18"/>
-                <w:lang w:eastAsia="en-IN"/>
-                <w14:ligatures w14:val="none"/>
-              </w:rPr>
-            </w:pPr>
-            <w:r>
-              <w:rPr>
-                <w:rFonts w:ascii="Times New Roman" w:eastAsia="Times New Roman" w:hAnsi="Times New Roman" w:cs="Times New Roman"/>
-                <w:color w:val="000000"/>
+                <w:color w:val="EE0000"/>
+                <w:kern w:val="0"/>
+                <w:sz w:val="18"/>
+                <w:szCs w:val="18"/>
+                <w:lang w:eastAsia="en-IN"/>
+                <w14:ligatures w14:val="none"/>
+              </w:rPr>
+            </w:pPr>
+            <w:r>
+              <w:rPr>
+                <w:rFonts w:ascii="Times New Roman" w:eastAsia="Times New Roman" w:hAnsi="Times New Roman" w:cs="Times New Roman"/>
+                <w:color w:val="EE0000"/>
                 <w:kern w:val="0"/>
                 <w:sz w:val="18"/>
                 <w:szCs w:val="18"/>
@@ -9187,18 +9187,18 @@
               <w:jc w:val="center"/>
               <w:rPr>
                 <w:rFonts w:ascii="Times New Roman" w:eastAsia="Times New Roman" w:hAnsi="Times New Roman" w:cs="Times New Roman"/>
-                <w:color w:val="000000"/>
-                <w:kern w:val="0"/>
-                <w:sz w:val="18"/>
-                <w:szCs w:val="18"/>
-                <w:lang w:eastAsia="en-IN"/>
-                <w14:ligatures w14:val="none"/>
-              </w:rPr>
-            </w:pPr>
-            <w:r>
-              <w:rPr>
-                <w:rFonts w:ascii="Times New Roman" w:eastAsia="Times New Roman" w:hAnsi="Times New Roman" w:cs="Times New Roman"/>
-                <w:color w:val="000000"/>
+                <w:color w:val="EE0000"/>
+                <w:kern w:val="0"/>
+                <w:sz w:val="18"/>
+                <w:szCs w:val="18"/>
+                <w:lang w:eastAsia="en-IN"/>
+                <w14:ligatures w14:val="none"/>
+              </w:rPr>
+            </w:pPr>
+            <w:r>
+              <w:rPr>
+                <w:rFonts w:ascii="Times New Roman" w:eastAsia="Times New Roman" w:hAnsi="Times New Roman" w:cs="Times New Roman"/>
+                <w:color w:val="EE0000"/>
                 <w:kern w:val="0"/>
                 <w:sz w:val="18"/>
                 <w:szCs w:val="18"/>
@@ -9356,18 +9356,18 @@
               <w:jc w:val="center"/>
               <w:rPr>
                 <w:rFonts w:ascii="Times New Roman" w:eastAsia="Times New Roman" w:hAnsi="Times New Roman" w:cs="Times New Roman"/>
-                <w:color w:val="000000"/>
-                <w:kern w:val="0"/>
-                <w:sz w:val="18"/>
-                <w:szCs w:val="18"/>
-                <w:lang w:eastAsia="en-IN"/>
-                <w14:ligatures w14:val="none"/>
-              </w:rPr>
-            </w:pPr>
-            <w:r>
-              <w:rPr>
-                <w:rFonts w:ascii="Times New Roman" w:eastAsia="Times New Roman" w:hAnsi="Times New Roman" w:cs="Times New Roman"/>
-                <w:color w:val="000000"/>
+                <w:color w:val="EE0000"/>
+                <w:kern w:val="0"/>
+                <w:sz w:val="18"/>
+                <w:szCs w:val="18"/>
+                <w:lang w:eastAsia="en-IN"/>
+                <w14:ligatures w14:val="none"/>
+              </w:rPr>
+            </w:pPr>
+            <w:r>
+              <w:rPr>
+                <w:rFonts w:ascii="Times New Roman" w:eastAsia="Times New Roman" w:hAnsi="Times New Roman" w:cs="Times New Roman"/>
+                <w:color w:val="EE0000"/>
                 <w:kern w:val="0"/>
                 <w:sz w:val="18"/>
                 <w:szCs w:val="18"/>
@@ -9525,18 +9525,18 @@
               <w:jc w:val="center"/>
               <w:rPr>
                 <w:rFonts w:ascii="Times New Roman" w:eastAsia="Times New Roman" w:hAnsi="Times New Roman" w:cs="Times New Roman"/>
-                <w:color w:val="000000"/>
-                <w:kern w:val="0"/>
-                <w:sz w:val="18"/>
-                <w:szCs w:val="18"/>
-                <w:lang w:eastAsia="en-IN"/>
-                <w14:ligatures w14:val="none"/>
-              </w:rPr>
-            </w:pPr>
-            <w:r>
-              <w:rPr>
-                <w:rFonts w:ascii="Times New Roman" w:eastAsia="Times New Roman" w:hAnsi="Times New Roman" w:cs="Times New Roman"/>
-                <w:color w:val="000000"/>
+                <w:color w:val="EE0000"/>
+                <w:kern w:val="0"/>
+                <w:sz w:val="18"/>
+                <w:szCs w:val="18"/>
+                <w:lang w:eastAsia="en-IN"/>
+                <w14:ligatures w14:val="none"/>
+              </w:rPr>
+            </w:pPr>
+            <w:r>
+              <w:rPr>
+                <w:rFonts w:ascii="Times New Roman" w:eastAsia="Times New Roman" w:hAnsi="Times New Roman" w:cs="Times New Roman"/>
+                <w:color w:val="EE0000"/>
                 <w:kern w:val="0"/>
                 <w:sz w:val="18"/>
                 <w:szCs w:val="18"/>
@@ -10491,7 +10491,7 @@
         <w:trPr>
           <w:gridAfter w:val="1"/>
           <w:wAfter w:w="36" w:type="dxa"/>
-          <w:trHeight w:val="408"/>
+          <w:trHeight w:val="450"/>
         </w:trPr>
         <w:tc>
           <w:tcPr>

</xml_diff>